<commit_message>
Sync from NAV (e477f3522dc9) (#140)
* Sync app code from NAV (e477f3522dc9)

* Merge DisabledTests and rulesets from NAV into BCApps, preserving existing entries and handling conflicts.

* Optimize file writing by tracking only modified files in SyncFromNAV.ps1

* Add new disabled tests for various codeunits and methods across multiple test files

* Add new disabled tests for various codeunits and methods across multiple test files
</commit_message>
<xml_diff>
--- a/src/Apps/CZ/AdvancePaymentsLocalization/app/Src/Reports/SalesAdvanceLetterEmail.docx
+++ b/src/Apps/CZ/AdvancePaymentsLocalization/app/Src/Reports/SalesAdvanceLetterEmail.docx
@@ -16,12 +16,14 @@
       <w:sdtContent>
         <w:p>
           <w:pPr>
-            <w:pStyle w:val="Title"/>
+            <w:pStyle w:val="Nzev"/>
             <w:spacing w:before="120"/>
           </w:pPr>
+          <w:proofErr w:type="spellStart"/>
           <w:r>
             <w:t>DocumentLbl</w:t>
           </w:r>
+          <w:proofErr w:type="spellEnd"/>
         </w:p>
       </w:sdtContent>
     </w:sdt>
@@ -38,9 +40,11 @@
           <w:text/>
         </w:sdtPr>
         <w:sdtContent>
+          <w:proofErr w:type="spellStart"/>
           <w:r>
             <w:t>GreetingLbl</w:t>
           </w:r>
+          <w:proofErr w:type="spellEnd"/>
         </w:sdtContent>
       </w:sdt>
       <w:r>
@@ -80,15 +84,17 @@
       </w:sdtPr>
       <w:sdtContent>
         <w:p>
+          <w:proofErr w:type="spellStart"/>
           <w:r>
             <w:t>BodyLbl</w:t>
           </w:r>
+          <w:proofErr w:type="spellEnd"/>
         </w:p>
       </w:sdtContent>
     </w:sdt>
     <w:tbl>
       <w:tblPr>
-        <w:tblStyle w:val="TableGrid"/>
+        <w:tblStyle w:val="Mkatabulky"/>
         <w:tblW w:w="10260" w:type="dxa"/>
         <w:tblBorders>
           <w:top w:val="none" w:color="auto" w:sz="0" w:space="0"/>
@@ -135,11 +141,13 @@
               </w:tcPr>
               <w:p>
                 <w:pPr>
-                  <w:pStyle w:val="Heading1"/>
+                  <w:pStyle w:val="Nadpis1"/>
                 </w:pPr>
+                <w:proofErr w:type="spellStart"/>
                 <w:r>
                   <w:t>DocumentNoLbl</w:t>
                 </w:r>
+                <w:proofErr w:type="spellEnd"/>
               </w:p>
             </w:tc>
           </w:sdtContent>
@@ -169,11 +177,13 @@
               </w:tcPr>
               <w:p>
                 <w:pPr>
-                  <w:pStyle w:val="Heading1"/>
+                  <w:pStyle w:val="Nadpis1"/>
                 </w:pPr>
+                <w:proofErr w:type="spellStart"/>
                 <w:r>
                   <w:t>AdvanceDueDate_SalesAdvancLetterHeaderCaption</w:t>
                 </w:r>
+                <w:proofErr w:type="spellEnd"/>
               </w:p>
             </w:tc>
           </w:sdtContent>
@@ -203,12 +213,14 @@
               </w:tcPr>
               <w:p>
                 <w:pPr>
-                  <w:pStyle w:val="Heading1"/>
+                  <w:pStyle w:val="Nadpis1"/>
                   <w:jc w:val="right"/>
                 </w:pPr>
+                <w:proofErr w:type="spellStart"/>
                 <w:r>
                   <w:t>AmountIncludingVATLbl</w:t>
                 </w:r>
+                <w:proofErr w:type="spellEnd"/>
               </w:p>
             </w:tc>
           </w:sdtContent>
@@ -239,9 +251,11 @@
                 <w:hideMark/>
               </w:tcPr>
               <w:p>
+                <w:proofErr w:type="spellStart"/>
                 <w:r>
                   <w:t>No_SalesAdvanceLetterHeader</w:t>
                 </w:r>
+                <w:proofErr w:type="spellEnd"/>
               </w:p>
             </w:tc>
           </w:sdtContent>
@@ -270,9 +284,11 @@
                 <w:hideMark/>
               </w:tcPr>
               <w:p>
+                <w:proofErr w:type="spellStart"/>
                 <w:r>
                   <w:t>AdvanceDueDate_SalesAdvancLetterHeader</w:t>
                 </w:r>
+                <w:proofErr w:type="spellEnd"/>
               </w:p>
             </w:tc>
           </w:sdtContent>
@@ -304,9 +320,11 @@
                 <w:pPr>
                   <w:jc w:val="right"/>
                 </w:pPr>
+                <w:proofErr w:type="spellStart"/>
                 <w:r>
                   <w:t>Formatted_AmountIncludingVAT</w:t>
                 </w:r>
+                <w:proofErr w:type="spellEnd"/>
               </w:p>
             </w:tc>
           </w:sdtContent>
@@ -332,7 +350,7 @@
     </w:tbl>
     <w:p>
       <w:pPr>
-        <w:pStyle w:val="Subtitle"/>
+        <w:pStyle w:val="Podnadpis"/>
       </w:pPr>
       <w:sdt>
         <w:sdtPr>
@@ -346,9 +364,11 @@
           <w:text/>
         </w:sdtPr>
         <w:sdtContent>
+          <w:proofErr w:type="spellStart"/>
           <w:r>
             <w:t>ClosingLbl</w:t>
           </w:r>
+          <w:proofErr w:type="spellEnd"/>
         </w:sdtContent>
       </w:sdt>
       <w:r>
@@ -368,144 +388,128 @@
       </w:sdtPr>
       <w:sdtContent>
         <w:p>
+          <w:proofErr w:type="spellStart"/>
           <w:r>
             <w:t>Name_SalespersonPurchaser</w:t>
           </w:r>
+          <w:proofErr w:type="spellEnd"/>
         </w:p>
       </w:sdtContent>
     </w:sdt>
-    <w:sdt>
-      <w:sdtPr>
-        <w:alias w:val="#Nav: /Company_Information/CompanyAddr1"/>
-        <w:tag w:val="#Nav: Sales_Advance_Letter_CZZ/31014"/>
-        <w:id w:val="-998657514"/>
-        <w:placeholder>
-          <w:docPart w:val="DefaultPlaceholder_-1854013440"/>
-        </w:placeholder>
-        <w:dataBinding w:prefixMappings="xmlns:ns0='urn:microsoft-dynamics-nav/reports/Sales_Advance_Letter_CZZ/31014/'" w:xpath="/ns0:NavWordReportXmlPart[1]/ns0:Company_Information[1]/ns0:CompanyAddr1[1]" w:storeItemID="{F58EE262-E80C-4E77-8531-F0B39E502D1C}"/>
-        <w:text/>
-      </w:sdtPr>
-      <w:sdtContent>
-        <w:p>
-          <w:pPr>
-            <w:pStyle w:val="NoSpacing"/>
-          </w:pPr>
+    <w:p>
+      <w:pPr>
+        <w:pStyle w:val="Bezmezer"/>
+      </w:pPr>
+      <w:sdt>
+        <w:sdtPr>
+          <w:id w:val="-1581822017"/>
+          <w:placeholder>
+            <w:docPart w:val="DefaultPlaceholder_-1854013440"/>
+          </w:placeholder>
+          <w15:dataBinding w:prefixMappings="xmlns:ns0='urn:microsoft-dynamics-nav/reports/Sales_Advance_Letter_CZZ/31014/' " w:xpath="/ns0:NavWordReportXmlPart[1]/ns0:Sales_Advance_Letter_Header[1]/ns0:CompanyAddress1[1]" w:storeItemID="{F58EE262-E80C-4E77-8531-F0B39E502D1C}" w16sdtdh:storeItemChecksum="lkAcUg=="/>
+        </w:sdtPr>
+        <w:sdtContent>
           <w:r>
-            <w:t>CompanyAddr1</w:t>
+            <w:t>CompanyAddress1</w:t>
           </w:r>
-        </w:p>
-      </w:sdtContent>
-    </w:sdt>
-    <w:sdt>
-      <w:sdtPr>
-        <w:alias w:val="#Nav: /Company_Information/CompanyAddr2"/>
-        <w:tag w:val="#Nav: Sales_Advance_Letter_CZZ/31014"/>
-        <w:id w:val="1771272025"/>
-        <w:placeholder>
-          <w:docPart w:val="DefaultPlaceholder_-1854013440"/>
-        </w:placeholder>
-        <w:dataBinding w:prefixMappings="xmlns:ns0='urn:microsoft-dynamics-nav/reports/Sales_Advance_Letter_CZZ/31014/'" w:xpath="/ns0:NavWordReportXmlPart[1]/ns0:Company_Information[1]/ns0:CompanyAddr2[1]" w:storeItemID="{F58EE262-E80C-4E77-8531-F0B39E502D1C}"/>
-        <w:text/>
-      </w:sdtPr>
-      <w:sdtContent>
-        <w:p>
-          <w:pPr>
-            <w:pStyle w:val="NoSpacing"/>
-          </w:pPr>
+        </w:sdtContent>
+      </w:sdt>
+    </w:p>
+    <w:p>
+      <w:pPr>
+        <w:pStyle w:val="Bezmezer"/>
+      </w:pPr>
+      <w:sdt>
+        <w:sdtPr>
+          <w:id w:val="750775761"/>
+          <w:placeholder>
+            <w:docPart w:val="DefaultPlaceholder_-1854013440"/>
+          </w:placeholder>
+          <w15:dataBinding w:prefixMappings="xmlns:ns0='urn:microsoft-dynamics-nav/reports/Sales_Advance_Letter_CZZ/31014/' " w:xpath="/ns0:NavWordReportXmlPart[1]/ns0:Sales_Advance_Letter_Header[1]/ns0:CompanyAddress2[1]" w:storeItemID="{F58EE262-E80C-4E77-8531-F0B39E502D1C}" w16sdtdh:storeItemChecksum="lkAcUg=="/>
+        </w:sdtPr>
+        <w:sdtContent>
           <w:r>
-            <w:t>CompanyAddr2</w:t>
+            <w:t>CompanyAddress2</w:t>
           </w:r>
-        </w:p>
-      </w:sdtContent>
-    </w:sdt>
-    <w:sdt>
-      <w:sdtPr>
-        <w:alias w:val="#Nav: /Company_Information/CompanyAddr3"/>
-        <w:tag w:val="#Nav: Sales_Advance_Letter_CZZ/31014"/>
-        <w:id w:val="-460348032"/>
-        <w:placeholder>
-          <w:docPart w:val="DefaultPlaceholder_-1854013440"/>
-        </w:placeholder>
-        <w:dataBinding w:prefixMappings="xmlns:ns0='urn:microsoft-dynamics-nav/reports/Sales_Advance_Letter_CZZ/31014/'" w:xpath="/ns0:NavWordReportXmlPart[1]/ns0:Company_Information[1]/ns0:CompanyAddr3[1]" w:storeItemID="{F58EE262-E80C-4E77-8531-F0B39E502D1C}"/>
-        <w:text/>
-      </w:sdtPr>
-      <w:sdtContent>
-        <w:p>
-          <w:pPr>
-            <w:pStyle w:val="NoSpacing"/>
-          </w:pPr>
+        </w:sdtContent>
+      </w:sdt>
+    </w:p>
+    <w:p>
+      <w:pPr>
+        <w:pStyle w:val="Bezmezer"/>
+      </w:pPr>
+      <w:sdt>
+        <w:sdtPr>
+          <w:id w:val="1385211777"/>
+          <w:placeholder>
+            <w:docPart w:val="DefaultPlaceholder_-1854013440"/>
+          </w:placeholder>
+          <w15:dataBinding w:prefixMappings="xmlns:ns0='urn:microsoft-dynamics-nav/reports/Sales_Advance_Letter_CZZ/31014/' " w:xpath="/ns0:NavWordReportXmlPart[1]/ns0:Sales_Advance_Letter_Header[1]/ns0:CompanyAddress3[1]" w:storeItemID="{F58EE262-E80C-4E77-8531-F0B39E502D1C}" w16sdtdh:storeItemChecksum="lkAcUg=="/>
+        </w:sdtPr>
+        <w:sdtContent>
           <w:r>
-            <w:t>CompanyAddr3</w:t>
+            <w:t>CompanyAddress3</w:t>
           </w:r>
-        </w:p>
-      </w:sdtContent>
-    </w:sdt>
-    <w:sdt>
-      <w:sdtPr>
-        <w:alias w:val="#Nav: /Company_Information/CompanyAddr4"/>
-        <w:tag w:val="#Nav: Sales_Advance_Letter_CZZ/31014"/>
-        <w:id w:val="-1727606490"/>
-        <w:placeholder>
-          <w:docPart w:val="DefaultPlaceholder_-1854013440"/>
-        </w:placeholder>
-        <w:dataBinding w:prefixMappings="xmlns:ns0='urn:microsoft-dynamics-nav/reports/Sales_Advance_Letter_CZZ/31014/'" w:xpath="/ns0:NavWordReportXmlPart[1]/ns0:Company_Information[1]/ns0:CompanyAddr4[1]" w:storeItemID="{F58EE262-E80C-4E77-8531-F0B39E502D1C}"/>
-        <w:text/>
-      </w:sdtPr>
-      <w:sdtContent>
-        <w:p>
-          <w:pPr>
-            <w:pStyle w:val="NoSpacing"/>
-          </w:pPr>
+        </w:sdtContent>
+      </w:sdt>
+    </w:p>
+    <w:p>
+      <w:pPr>
+        <w:pStyle w:val="Bezmezer"/>
+      </w:pPr>
+      <w:sdt>
+        <w:sdtPr>
+          <w:id w:val="1343201446"/>
+          <w:placeholder>
+            <w:docPart w:val="DefaultPlaceholder_-1854013440"/>
+          </w:placeholder>
+          <w15:dataBinding w:prefixMappings="xmlns:ns0='urn:microsoft-dynamics-nav/reports/Sales_Advance_Letter_CZZ/31014/' " w:xpath="/ns0:NavWordReportXmlPart[1]/ns0:Sales_Advance_Letter_Header[1]/ns0:CompanyAddress4[1]" w:storeItemID="{F58EE262-E80C-4E77-8531-F0B39E502D1C}" w16sdtdh:storeItemChecksum="lkAcUg=="/>
+        </w:sdtPr>
+        <w:sdtContent>
           <w:r>
-            <w:t>CompanyAddr4</w:t>
+            <w:t>CompanyAddress4</w:t>
           </w:r>
-        </w:p>
-      </w:sdtContent>
-    </w:sdt>
-    <w:sdt>
-      <w:sdtPr>
-        <w:alias w:val="#Nav: /Company_Information/CompanyAddr5"/>
-        <w:tag w:val="#Nav: Sales_Advance_Letter_CZZ/31014"/>
-        <w:id w:val="1279147269"/>
-        <w:placeholder>
-          <w:docPart w:val="DefaultPlaceholder_-1854013440"/>
-        </w:placeholder>
-        <w:dataBinding w:prefixMappings="xmlns:ns0='urn:microsoft-dynamics-nav/reports/Sales_Advance_Letter_CZZ/31014/'" w:xpath="/ns0:NavWordReportXmlPart[1]/ns0:Company_Information[1]/ns0:CompanyAddr5[1]" w:storeItemID="{F58EE262-E80C-4E77-8531-F0B39E502D1C}"/>
-        <w:text/>
-      </w:sdtPr>
-      <w:sdtContent>
-        <w:p>
-          <w:pPr>
-            <w:pStyle w:val="NoSpacing"/>
-          </w:pPr>
+        </w:sdtContent>
+      </w:sdt>
+    </w:p>
+    <w:p>
+      <w:pPr>
+        <w:pStyle w:val="Bezmezer"/>
+      </w:pPr>
+      <w:sdt>
+        <w:sdtPr>
+          <w:id w:val="-49074115"/>
+          <w:placeholder>
+            <w:docPart w:val="DefaultPlaceholder_-1854013440"/>
+          </w:placeholder>
+          <w15:dataBinding w:prefixMappings="xmlns:ns0='urn:microsoft-dynamics-nav/reports/Sales_Advance_Letter_CZZ/31014/' " w:xpath="/ns0:NavWordReportXmlPart[1]/ns0:Sales_Advance_Letter_Header[1]/ns0:CompanyAddress5[1]" w:storeItemID="{F58EE262-E80C-4E77-8531-F0B39E502D1C}" w16sdtdh:storeItemChecksum="lkAcUg=="/>
+        </w:sdtPr>
+        <w:sdtContent>
           <w:r>
-            <w:t>CompanyAddr5</w:t>
+            <w:t>CompanyAddress5</w:t>
           </w:r>
-        </w:p>
-      </w:sdtContent>
-    </w:sdt>
-    <w:sdt>
-      <w:sdtPr>
-        <w:alias w:val="#Nav: /Company_Information/CompanyAddr6"/>
-        <w:tag w:val="#Nav: Sales_Advance_Letter_CZZ/31014"/>
-        <w:id w:val="546026793"/>
-        <w:placeholder>
-          <w:docPart w:val="DefaultPlaceholder_-1854013440"/>
-        </w:placeholder>
-        <w:dataBinding w:prefixMappings="xmlns:ns0='urn:microsoft-dynamics-nav/reports/Sales_Advance_Letter_CZZ/31014/'" w:xpath="/ns0:NavWordReportXmlPart[1]/ns0:Company_Information[1]/ns0:CompanyAddr6[1]" w:storeItemID="{F58EE262-E80C-4E77-8531-F0B39E502D1C}"/>
-        <w:text/>
-      </w:sdtPr>
-      <w:sdtContent>
-        <w:p>
-          <w:pPr>
-            <w:pStyle w:val="NoSpacing"/>
-          </w:pPr>
+        </w:sdtContent>
+      </w:sdt>
+    </w:p>
+    <w:p>
+      <w:pPr>
+        <w:pStyle w:val="Bezmezer"/>
+      </w:pPr>
+      <w:sdt>
+        <w:sdtPr>
+          <w:id w:val="1198132410"/>
+          <w:placeholder>
+            <w:docPart w:val="DefaultPlaceholder_-1854013440"/>
+          </w:placeholder>
+          <w15:dataBinding w:prefixMappings="xmlns:ns0='urn:microsoft-dynamics-nav/reports/Sales_Advance_Letter_CZZ/31014/' " w:xpath="/ns0:NavWordReportXmlPart[1]/ns0:Sales_Advance_Letter_Header[1]/ns0:CompanyAddress6[1]" w:storeItemID="{F58EE262-E80C-4E77-8531-F0B39E502D1C}" w16sdtdh:storeItemChecksum="lkAcUg=="/>
+        </w:sdtPr>
+        <w:sdtContent>
           <w:r>
-            <w:t>CompanyAddr6</w:t>
+            <w:t>CompanyAddress6</w:t>
           </w:r>
-        </w:p>
-      </w:sdtContent>
-    </w:sdt>
+        </w:sdtContent>
+      </w:sdt>
+    </w:p>
     <w:p/>
     <w:sectPr>
       <w:pgSz w:w="11906" w:h="16838"/>
@@ -912,15 +916,15 @@
     <w:lsdException w:name="Unresolved Mention" w:semiHidden="1" w:unhideWhenUsed="1"/>
     <w:lsdException w:name="Smart Link" w:semiHidden="1" w:unhideWhenUsed="1"/>
   </w:latentStyles>
-  <w:style w:type="paragraph" w:default="1" w:styleId="Normal">
+  <w:style w:type="paragraph" w:default="1" w:styleId="Normln">
     <w:name w:val="Normal"/>
     <w:qFormat/>
   </w:style>
-  <w:style w:type="paragraph" w:styleId="Heading1">
+  <w:style w:type="paragraph" w:styleId="Nadpis1">
     <w:name w:val="heading 1"/>
-    <w:basedOn w:val="Normal"/>
-    <w:next w:val="Normal"/>
-    <w:link w:val="Heading1Char"/>
+    <w:basedOn w:val="Normln"/>
+    <w:next w:val="Normln"/>
+    <w:link w:val="Nadpis1Char"/>
     <w:uiPriority w:val="9"/>
     <w:qFormat/>
     <w:rsid w:val="00B419A6"/>
@@ -935,13 +939,13 @@
       <w:szCs w:val="16"/>
     </w:rPr>
   </w:style>
-  <w:style w:type="character" w:default="1" w:styleId="DefaultParagraphFont">
+  <w:style w:type="character" w:default="1" w:styleId="Standardnpsmoodstavce">
     <w:name w:val="Default Paragraph Font"/>
     <w:uiPriority w:val="1"/>
     <w:semiHidden/>
     <w:unhideWhenUsed/>
   </w:style>
-  <w:style w:type="table" w:default="1" w:styleId="TableNormal">
+  <w:style w:type="table" w:default="1" w:styleId="Normlntabulka">
     <w:name w:val="Normal Table"/>
     <w:uiPriority w:val="99"/>
     <w:semiHidden/>
@@ -956,16 +960,16 @@
       </w:tblCellMar>
     </w:tblPr>
   </w:style>
-  <w:style w:type="numbering" w:default="1" w:styleId="NoList">
+  <w:style w:type="numbering" w:default="1" w:styleId="Bezseznamu">
     <w:name w:val="No List"/>
     <w:uiPriority w:val="99"/>
     <w:semiHidden/>
     <w:unhideWhenUsed/>
   </w:style>
-  <w:style w:type="character" w:customStyle="1" w:styleId="Heading1Char">
-    <w:name w:val="Heading 1 Char"/>
-    <w:basedOn w:val="DefaultParagraphFont"/>
-    <w:link w:val="Heading1"/>
+  <w:style w:type="character" w:customStyle="1" w:styleId="Nadpis1Char">
+    <w:name w:val="Nadpis 1 Char"/>
+    <w:basedOn w:val="Standardnpsmoodstavce"/>
+    <w:link w:val="Nadpis1"/>
     <w:uiPriority w:val="9"/>
     <w:rsid w:val="00B419A6"/>
     <w:rPr>
@@ -975,9 +979,9 @@
       <w:szCs w:val="16"/>
     </w:rPr>
   </w:style>
-  <w:style w:type="table" w:styleId="TableGrid">
+  <w:style w:type="table" w:styleId="Mkatabulky">
     <w:name w:val="Table Grid"/>
-    <w:basedOn w:val="TableNormal"/>
+    <w:basedOn w:val="Normlntabulka"/>
     <w:uiPriority w:val="39"/>
     <w:rsid w:val="00B419A6"/>
     <w:pPr>
@@ -994,7 +998,7 @@
       </w:tblBorders>
     </w:tblPr>
   </w:style>
-  <w:style w:type="paragraph" w:styleId="NoSpacing">
+  <w:style w:type="paragraph" w:styleId="Bezmezer">
     <w:name w:val="No Spacing"/>
     <w:uiPriority w:val="1"/>
     <w:qFormat/>
@@ -1003,11 +1007,11 @@
       <w:spacing w:after="0" w:line="240" w:lineRule="auto"/>
     </w:pPr>
   </w:style>
-  <w:style w:type="paragraph" w:styleId="Title">
+  <w:style w:type="paragraph" w:styleId="Nzev">
     <w:name w:val="Title"/>
-    <w:basedOn w:val="Header"/>
-    <w:next w:val="Normal"/>
-    <w:link w:val="TitleChar"/>
+    <w:basedOn w:val="Zhlav"/>
+    <w:next w:val="Normln"/>
+    <w:link w:val="NzevChar"/>
     <w:uiPriority w:val="10"/>
     <w:qFormat/>
     <w:rsid w:val="00B419A6"/>
@@ -1019,10 +1023,10 @@
       <w:sz w:val="36"/>
     </w:rPr>
   </w:style>
-  <w:style w:type="character" w:customStyle="1" w:styleId="TitleChar">
-    <w:name w:val="Title Char"/>
-    <w:basedOn w:val="DefaultParagraphFont"/>
-    <w:link w:val="Title"/>
+  <w:style w:type="character" w:customStyle="1" w:styleId="NzevChar">
+    <w:name w:val="Název Char"/>
+    <w:basedOn w:val="Standardnpsmoodstavce"/>
+    <w:link w:val="Nzev"/>
     <w:uiPriority w:val="10"/>
     <w:rsid w:val="00B419A6"/>
     <w:rPr>
@@ -1030,11 +1034,11 @@
       <w:sz w:val="36"/>
     </w:rPr>
   </w:style>
-  <w:style w:type="paragraph" w:styleId="Subtitle">
+  <w:style w:type="paragraph" w:styleId="Podnadpis">
     <w:name w:val="Subtitle"/>
-    <w:basedOn w:val="Header"/>
-    <w:next w:val="Normal"/>
-    <w:link w:val="SubtitleChar"/>
+    <w:basedOn w:val="Zhlav"/>
+    <w:next w:val="Normln"/>
+    <w:link w:val="PodnadpisChar"/>
     <w:uiPriority w:val="11"/>
     <w:qFormat/>
     <w:rsid w:val="00B419A6"/>
@@ -1043,10 +1047,10 @@
       <w:szCs w:val="20"/>
     </w:rPr>
   </w:style>
-  <w:style w:type="character" w:customStyle="1" w:styleId="SubtitleChar">
-    <w:name w:val="Subtitle Char"/>
-    <w:basedOn w:val="DefaultParagraphFont"/>
-    <w:link w:val="Subtitle"/>
+  <w:style w:type="character" w:customStyle="1" w:styleId="PodnadpisChar">
+    <w:name w:val="Podnadpis Char"/>
+    <w:basedOn w:val="Standardnpsmoodstavce"/>
+    <w:link w:val="Podnadpis"/>
     <w:uiPriority w:val="11"/>
     <w:rsid w:val="00B419A6"/>
     <w:rPr>
@@ -1054,10 +1058,10 @@
       <w:szCs w:val="20"/>
     </w:rPr>
   </w:style>
-  <w:style w:type="paragraph" w:styleId="Header">
+  <w:style w:type="paragraph" w:styleId="Zhlav">
     <w:name w:val="header"/>
-    <w:basedOn w:val="Normal"/>
-    <w:link w:val="HeaderChar"/>
+    <w:basedOn w:val="Normln"/>
+    <w:link w:val="ZhlavChar"/>
     <w:uiPriority w:val="99"/>
     <w:semiHidden/>
     <w:unhideWhenUsed/>
@@ -1070,17 +1074,17 @@
       <w:spacing w:after="0" w:line="240" w:lineRule="auto"/>
     </w:pPr>
   </w:style>
-  <w:style w:type="character" w:customStyle="1" w:styleId="HeaderChar">
-    <w:name w:val="Header Char"/>
-    <w:basedOn w:val="DefaultParagraphFont"/>
-    <w:link w:val="Header"/>
+  <w:style w:type="character" w:customStyle="1" w:styleId="ZhlavChar">
+    <w:name w:val="Záhlaví Char"/>
+    <w:basedOn w:val="Standardnpsmoodstavce"/>
+    <w:link w:val="Zhlav"/>
     <w:uiPriority w:val="99"/>
     <w:semiHidden/>
     <w:rsid w:val="00B419A6"/>
   </w:style>
-  <w:style w:type="character" w:styleId="PlaceholderText">
+  <w:style w:type="character" w:styleId="Zstupntext">
     <w:name w:val="Placeholder Text"/>
-    <w:basedOn w:val="DefaultParagraphFont"/>
+    <w:basedOn w:val="Standardnpsmoodstavce"/>
     <w:uiPriority w:val="99"/>
     <w:semiHidden/>
     <w:rsid w:val="00B419A6"/>
@@ -1113,7 +1117,7 @@
         <w:p>
           <w:r>
             <w:rPr>
-              <w:rStyle w:val="PlaceholderText"/>
+              <w:rStyle w:val="Zstupntext"/>
             </w:rPr>
             <w:t>Click or tap here to enter text.</w:t>
           </w:r>
@@ -1178,8 +1182,10 @@
   </w:compat>
   <w:rsids>
     <w:rsidRoot w:val="00F8012F"/>
+    <w:rsid w:val="002D6C90"/>
     <w:rsid w:val="005F766D"/>
     <w:rsid w:val="009A00F1"/>
+    <w:rsid w:val="009F220E"/>
     <w:rsid w:val="00BC4817"/>
     <w:rsid w:val="00CB3F5B"/>
     <w:rsid w:val="00D759A1"/>
@@ -1601,17 +1607,17 @@
     <w:lsdException w:name="Unresolved Mention" w:semiHidden="1" w:unhideWhenUsed="1"/>
     <w:lsdException w:name="Smart Link" w:semiHidden="1" w:unhideWhenUsed="1"/>
   </w:latentStyles>
-  <w:style w:type="paragraph" w:default="1" w:styleId="Normal">
+  <w:style w:type="paragraph" w:default="1" w:styleId="Normln">
     <w:name w:val="Normal"/>
     <w:qFormat/>
   </w:style>
-  <w:style w:type="character" w:default="1" w:styleId="DefaultParagraphFont">
+  <w:style w:type="character" w:default="1" w:styleId="Standardnpsmoodstavce">
     <w:name w:val="Default Paragraph Font"/>
     <w:uiPriority w:val="1"/>
     <w:semiHidden/>
     <w:unhideWhenUsed/>
   </w:style>
-  <w:style w:type="table" w:default="1" w:styleId="TableNormal">
+  <w:style w:type="table" w:default="1" w:styleId="Normlntabulka">
     <w:name w:val="Normal Table"/>
     <w:uiPriority w:val="99"/>
     <w:semiHidden/>
@@ -1626,15 +1632,15 @@
       </w:tblCellMar>
     </w:tblPr>
   </w:style>
-  <w:style w:type="numbering" w:default="1" w:styleId="NoList">
+  <w:style w:type="numbering" w:default="1" w:styleId="Bezseznamu">
     <w:name w:val="No List"/>
     <w:uiPriority w:val="99"/>
     <w:semiHidden/>
     <w:unhideWhenUsed/>
   </w:style>
-  <w:style w:type="character" w:styleId="PlaceholderText">
+  <w:style w:type="character" w:styleId="Zstupntext">
     <w:name w:val="Placeholder Text"/>
-    <w:basedOn w:val="DefaultParagraphFont"/>
+    <w:basedOn w:val="Standardnpsmoodstavce"/>
     <w:uiPriority w:val="99"/>
     <w:semiHidden/>
     <w:rsid w:val="00BC4817"/>
@@ -2073,6 +2079,18 @@
  
          < C l o s i n g L b l > C l o s i n g L b l < / C l o s i n g L b l >   
+         < C o m p a n y A d d r e s s 1 > C o m p a n y A d d r e s s 1 < / C o m p a n y A d d r e s s 1 > + 
+         < C o m p a n y A d d r e s s 2 > C o m p a n y A d d r e s s 2 < / C o m p a n y A d d r e s s 2 > + 
+         < C o m p a n y A d d r e s s 3 > C o m p a n y A d d r e s s 3 < / C o m p a n y A d d r e s s 3 > + 
+         < C o m p a n y A d d r e s s 4 > C o m p a n y A d d r e s s 4 < / C o m p a n y A d d r e s s 4 > + 
+         < C o m p a n y A d d r e s s 5 > C o m p a n y A d d r e s s 5 < / C o m p a n y A d d r e s s 5 > + 
+         < C o m p a n y A d d r e s s 6 > C o m p a n y A d d r e s s 6 < / C o m p a n y A d d r e s s 6 > + 
          < C o p y L b l > C o p y L b l < / C o p y L b l >   
          < C r e a t o r L b l > C r e a t o r L b l < / C r e a t o r L b l > 
</xml_diff>